<commit_message>
Revisa a Nota Técnica do POP de Pregão/Licitação (achados 3 e 5 e inconsistência da NAD)
Co-Authored-By: Claude Sonnet 5.5 <noreply@anthropic.com>
Claude-Session: https://claude.ai/code/session_019hKSviCnF5ihoMnErm9Cu3
</commit_message>
<xml_diff>
--- a/Nota_Tecnica_ASSGER_POP_Pregao_Licitacao.docx
+++ b/Nota_Tecnica_ASSGER_POP_Pregao_Licitacao.docx
@@ -8451,7 +8451,7 @@
           <w:sz w:val="20"/>
           <w:szCs w:val="20"/>
         </w:rPr>
-        <w:t xml:space="preserve">Etapas 10 e 11 – NAD e empenho: na etapa 10, a GERORT/SUPLAN já emite a NAD e pede autorização à CHEGAB; na etapa 11, a PRESI devolve o processo à DIRPLA/GERORT, "que irá emitir a NAD". A NAD aparece emitida duas vezes, e a emissão da Nota de Empenho não tem etapa própria.</w:t>
+        <w:t xml:space="preserve">Etapas 9, 10 e 11 – contratação no SIGA, NAD e empenho: no POP vigente (B.12 a B.16) a sequência é criar a contratação no SIGA, aprová-la (DIRAF), emitir a NAD, autorizar o empenho (Presidência) e emitir a Nota de Empenho. Na sugestão, a NAD é emitida na etapa 10, antes de a Presidência aprovar a contratação no SIGA (etapa 11), e a etapa 11 manda a DIRPLA/GERORT emitir uma NAD que já foi emitida. A emissão da NAD/Empenho consta como da SUPLAN (etapa 9b) e da DIRPLA/GERORT (etapa 11), e a Nota de Empenho não tem etapa própria. Recomenda-se ordenar a sequência (criar a contratação no SIGA, aprovação da Presidência, emitir a NAD, autorizar o empenho, emitir a Nota de Empenho) e indicar um único responsável pela emissão.</w:t>
       </w:r>
     </w:p>
     <w:p>
@@ -10302,7 +10302,7 @@
                 <w:sz w:val="18"/>
                 <w:szCs w:val="18"/>
               </w:rPr>
-              <w:t xml:space="preserve">Incluir a negociação depois da aceitação da proposta e antes da habilitação.</w:t>
+              <w:t xml:space="preserve">Incluir a negociação depois da aceitação da proposta e antes da habilitação. No julgamento, observar também os arts. 75 a 83 do RILC (desempate, preferência de ME e EPP e confirmação da primeira colocação).</w:t>
             </w:r>
           </w:p>
         </w:tc>
@@ -11220,7 +11220,7 @@
                 <w:sz w:val="18"/>
                 <w:szCs w:val="18"/>
               </w:rPr>
-              <w:t xml:space="preserve">A consulta ao CEIS/CNEP foi retirada e a verificação do art. 10 ficou só com o RH. O RH consegue verificar vínculo de empregados e parentesco, mas não as sanções e a inidoneidade dos incisos II a VIII.</w:t>
+              <w:t xml:space="preserve">A consulta ao CEIS e ao CNEP foi retirada. A verificação do art. 10 do RILC fica só com o RH, e a sugestão não prevê a consulta às listas de sanção (incisos II a VIII).</w:t>
             </w:r>
           </w:p>
         </w:tc>

</xml_diff>